<commit_message>
non alimentaire commentaire moins mensuel
</commit_message>
<xml_diff>
--- a/Rapports_mensuels/Mois2026_08/ipc_note_08_ang_2026_08.docx
+++ b/Rapports_mensuels/Mois2026_08/ipc_note_08_ang_2026_08.docx
@@ -67,7 +67,7 @@
                 <w:szCs w:val="22"/>
                 <w:color w:val="8D4354"/>
               </w:rPr>
-              <w:t xml:space="preserve">Consumer Price Index - Août 2026</w:t>
+              <w:t xml:space="preserve">Consumer Price Index - August 2026</w:t>
             </w:r>
           </w:p>
         </w:tc>
@@ -121,7 +121,7 @@
                 <w:szCs w:val="22"/>
                 <w:color w:val="8D4354"/>
               </w:rPr>
-              <w:t xml:space="preserve">Ville de Tanger</w:t>
+              <w:t xml:space="preserve">City of Tetouan</w:t>
             </w:r>
           </w:p>
         </w:tc>
@@ -132,7 +132,7 @@
         <w:pStyle w:val="ipcpara0"/>
       </w:pPr>
       <w:r>
-        <w:t xml:space="preserve">En Août 2026, l’indice des prix à la consommation des ménages de la ville de Tanger a augmenté de 0,9% par rapport au mois précédent. En glissement annuel, il a décru de 0,3%.</w:t>
+        <w:t xml:space="preserve">In August 2026, the consumer price index for households increased by 1,2% compared to the previous month. On an annual level, the consumer price index increased by 0,7% over a full year.</w:t>
       </w:r>
     </w:p>
     <w:p>
@@ -160,7 +160,7 @@
         <w:t xml:space="preserve"> </w:t>
       </w:r>
       <w:r>
-        <w:t xml:space="preserve">l’indice des prix des produits alimentaires a augmenté de 1,3% en Août 2026 par rapport à Juillet 2026, résultat de la hausse des prix des «Viandes» de 5,5%, du «Lait, fromage et œufs» de 4,2%, des «Poisson et fruits de mer» de 1,6%, des «Produits alimentaires non classés ailleurs» de 0,8% et du «Sucre, confiture, miel, chocolat et confiserie», des «Eaux minerales, boissons rafraichissantes et jus de fruits et de légumes» de 0,1%.</w:t>
+        <w:t xml:space="preserve">The food product price index increased by 1,6% in August 2026 compared to July 2026, as a result of the rise in prices of «Fish and Seafood» by 7,2%, «Meat» by 5,7%, «Milk, Cheese and Eggs» by 1,3%, «Food Productsnot elsewhere classified» by 0,9%, «Cafe, Tea and Cocoa» by 0,4% and «Mineral Waters, Soft Drinks, Fruit and Vegetable Juices (Nd)» by 0,1%.</w:t>
       </w:r>
     </w:p>
     <w:p>
@@ -168,7 +168,7 @@
         <w:pStyle w:val="ipccorps"/>
       </w:pPr>
       <w:r>
-        <w:t xml:space="preserve">De même, la variation mensuelle de l’indice des produits non alimentaires a accru de 0,6% en raison de la hausse des prix des divisions suivantes: des «Transports» de 3,4%, des «Restaurants et hôtels» de 0,8%, des «Biens et services divers» de 0,4% et des «Articles d’habillement et chaussures» et des «Communications» de 0,2%. Aussi la baisse des prix de la division: des «Loisirs et culture» de 0,3%. Ainsi que, la stagnation des indices des autres divisions n’ont pas impacté l’évolution générale.</w:t>
+        <w:t xml:space="preserve">Similarly, the monthly variation of the index for the non-food products increased by 0,9% due to the increase in prices in the following divisions: «Transportation» by 6,2%, «Restaurants and Hotels» by 0,9%, «Various Goods and Services» by 0,2% and «Furniture, Household Items and Routine Home Maintenance» by 0,1%. Also, the decrease in prices of the following divisions: «Clothing and Shoes» and «Communications» by 0,2%. Thus, the stagnation of the indices of the other divisions did not impact the general evolution. NA NA NA the monthly variation of the index for the non-food products increased by 0,9% due to the increase in prices in the following divisions: «Transportation» by 6,2%, «Restaurants and Hotels» by 0,9%, «Various Goods and Services» by 0,2% and «Furniture, Household Items and Routine Home Maintenance» by 0,1%. Also, the decrease in prices of the following divisions: «Clothing and Shoes» and «Communications» by 0,2%. Thus, the stagnation of the indices of the other divisions did not impact the general evolution. the monthly variation of the index for the non-food products increased by 0,9% due to the increase in prices in the following divisions: «Transportation» by 6,2%, «Restaurants and Hotels» by 0,9%, «Various Goods and Services» by 0,2% and «Furniture, Household Items and Routine Home Maintenance» by 0,1%. Also, the decrease in prices of the following divisions: «Clothing and Shoes» and «Communications» by 0,2%. Thus, the stagnation of the indices of the other divisions did not impact the general evolution.</w:t>
       </w:r>
     </w:p>
     <w:p>
@@ -186,19 +186,7 @@
         <w:t xml:space="preserve"> </w:t>
       </w:r>
       <w:r>
-        <w:t xml:space="preserve">l’indice des prix des produits alimentaires</w:t>
-      </w:r>
-      <w:r>
-        <w:t xml:space="preserve"> </w:t>
-      </w:r>
-      <w:r>
-        <w:t xml:space="preserve">a baissé de 4,3% en Août 2026 par rapport à Août 2025, sous l’effet de la diminution des</w:t>
-      </w:r>
-      <w:r>
-        <w:t xml:space="preserve"> </w:t>
-      </w:r>
-      <w:r>
-        <w:t xml:space="preserve">prix des «Huiles et graisses» de 21,5%, des «Fruits» de 7,5%, des «Légumes» de 4,9%, des «Viandes» de 3,1%, du «Lait, fromage et œufs» de 3,0%, du «Café, thé et cacao» de 0,6% et des «Produits alimentaires non classés ailleurs» de 0,4%. Par ailleurs, l’augmentation des prix des «Tabac» de 4,0%, des «Eaux minerales, boissons rafraichissantes, jus de fruits et de légumes» de 2,2%, des «Pain et céréales» et des «Poisson et fruits de mer» de 1,9% et du «Sucre, confiture, miel, chocolat et confiserie» de 0,6% et la stagnation des prix NA n’ont pas affecté l’évolution générale.</w:t>
+        <w:t xml:space="preserve">the food product price index decreased by 2,9% in August 2026 compared to August 2025 , due to the decrease in the prices of «Oils and Fats» by 18,3%, «Fruits» by 8,5%, «Vegetables» by 5,3%, «Milk, Cheese and Eggs» by 4,8%, «Fish and Seafood» by 2,9%, «Bread and Cereals» by 0,3% and «Food Productsnot elsewhere classified» by 0,1%. Moreover, the rise in prices of «Meat» by 6,9%, «Tobacco» by 4,0%, «Sugar, Jam, Honey, Chocolate and Confectionery» by 2,1%, «Cafe, Tea and Cocoa» by 0,6% and «Mineral Waters, Soft Drinks, Fruit and Vegetable Juices (Nd)» by 0,4% and the stagnation in prices for NA did not affect the general evolution.</w:t>
       </w:r>
     </w:p>
     <w:p>
@@ -206,7 +194,7 @@
         <w:pStyle w:val="ipccorps"/>
       </w:pPr>
       <w:r>
-        <w:t xml:space="preserve">Par ailleurs, la variation annuelle de l’indice des produits non alimentaires a augmenté de 2,3%. Alors que la variation des prix des divisions qui constituent les produits non alimentaires a fluctué entre une diminution de 1,3% pour la division des «Communications» et une augmentation de 8,5% pour la division des «Biens et services divers»</w:t>
+        <w:t xml:space="preserve">On the other hand, the annual variation in the non-food index increased by 3,6%. While the variation in prices of the divisions that make up non-food products fluctuated between a decrease of the division of «Clothing and Shoes» by 1,3% and the rise of the division of «Transportation» by 12,4%</w:t>
       </w:r>
     </w:p>
     <w:p>
@@ -214,7 +202,7 @@
         <w:pStyle w:val="ipctitre0"/>
       </w:pPr>
       <w:r>
-        <w:t xml:space="preserve">1- Évolution du taux de la variation annuelle (%) de l’indice des prix à la consommation pour le mois De Août</w:t>
+        <w:t xml:space="preserve">3- Annual evolution (%) of the consumer price index for the month of August</w:t>
       </w:r>
     </w:p>
     <w:p>
@@ -231,7 +219,7 @@
               <a:graphicData uri="http://schemas.openxmlformats.org/drawingml/2006/picture">
                 <pic:pic>
                   <pic:nvPicPr>
-                    <pic:cNvPr descr="../../Rapports_mensuels/Mois2026_08/Graphique_variation_annuelle2026_08_Ville10_fr.png" id="22" name="Picture"/>
+                    <pic:cNvPr descr="../../Rapports_mensuels/Mois2026_08/Graphique_variation_annuelle2026_08_Ville08_ang.png" id="22" name="Picture"/>
                     <pic:cNvPicPr>
                       <a:picLocks noChangeArrowheads="1" noChangeAspect="1"/>
                     </pic:cNvPicPr>
@@ -272,13 +260,13 @@
         <w:rPr>
           <w:u w:val="single"/>
         </w:rPr>
-        <w:t xml:space="preserve">Lecture:</w:t>
+        <w:t xml:space="preserve">Reading:</w:t>
       </w:r>
       <w:r>
         <w:t xml:space="preserve"> </w:t>
       </w:r>
       <w:r>
-        <w:t xml:space="preserve">En Août 2026, l’indice des prix à la consommation a décru de 0,3% par rapport à Août 2025</w:t>
+        <w:t xml:space="preserve">In August 2026, the consumer price index increased by 0,7% compared to August 2025</w:t>
       </w:r>
     </w:p>
     <w:p>
@@ -286,7 +274,7 @@
         <w:pStyle w:val="ipctitre0"/>
       </w:pPr>
       <w:r>
-        <w:t xml:space="preserve">2- Évolution de la variation mensuelle (%) de l’indice des prix à la consommation</w:t>
+        <w:t xml:space="preserve">4- Annual evolution (%) of the consumer price index for the month of August</w:t>
       </w:r>
     </w:p>
     <w:p>
@@ -303,7 +291,7 @@
               <a:graphicData uri="http://schemas.openxmlformats.org/drawingml/2006/picture">
                 <pic:pic>
                   <pic:nvPicPr>
-                    <pic:cNvPr descr="../../Rapports_mensuels/Mois2026_08/Graphique_variation_mensuelle2026_08_Ville10_fr.png" id="25" name="Picture"/>
+                    <pic:cNvPr descr="../../Rapports_mensuels/Mois2026_08/Graphique_variation_mensuelle2026_08_Ville08_ang.png" id="25" name="Picture"/>
                     <pic:cNvPicPr>
                       <a:picLocks noChangeArrowheads="1" noChangeAspect="1"/>
                     </pic:cNvPicPr>
@@ -344,13 +332,13 @@
         <w:rPr>
           <w:u w:val="single"/>
         </w:rPr>
-        <w:t xml:space="preserve">Lecture:</w:t>
+        <w:t xml:space="preserve">Reading:</w:t>
       </w:r>
       <w:r>
         <w:t xml:space="preserve"> </w:t>
       </w:r>
       <w:r>
-        <w:t xml:space="preserve">La variation des prix en Août 2026 a augmenté de 0,9% après avoir été de -1,1% en Juillet 2026</w:t>
+        <w:t xml:space="preserve">The level of price variation in August 2026 increased by 1,2% after being -0,7% in June 2026</w:t>
       </w:r>
     </w:p>
     <w:p>
@@ -368,7 +356,7 @@
         <w:pStyle w:val="ipcpara0"/>
       </w:pPr>
       <w:r>
-        <w:t xml:space="preserve">Tableau 2: Indice des prix à la consommation de la ville de Tanger: d’Août 2026 (base 2017: 100)</w:t>
+        <w:t xml:space="preserve">Table 3: Consumer price index for the city of Tetouan: August 2026 (2017 base: 100)</w:t>
       </w:r>
     </w:p>
     <w:tbl xmlns:w="http://schemas.openxmlformats.org/wordprocessingml/2006/main" xmlns:r="http://schemas.openxmlformats.org/officeDocument/2006/relationships" xmlns:w14="http://schemas.microsoft.com/office/word/2010/wordml" xmlns:wp="http://schemas.openxmlformats.org/drawingml/2006/wordprocessingDrawing" xmlns:a="http://schemas.openxmlformats.org/drawingml/2006/main" xmlns:pic="http://schemas.openxmlformats.org/drawingml/2006/picture">
@@ -446,7 +434,7 @@
                 <w:szCs w:val="14"/>
                 <w:color w:val="000000"/>
               </w:rPr>
-              <w:t xml:space="preserve">Divisions de produits</w:t>
+              <w:t xml:space="preserve">Product Divisions</w:t>
             </w:r>
           </w:p>
         </w:tc>
@@ -501,7 +489,7 @@
                 <w:szCs w:val="14"/>
                 <w:color w:val="000000"/>
               </w:rPr>
-              <w:t xml:space="preserve">Pondérations</w:t>
+              <w:t xml:space="preserve">Weightings</w:t>
             </w:r>
           </w:p>
         </w:tc>
@@ -556,7 +544,7 @@
                 <w:szCs w:val="14"/>
                 <w:color w:val="000000"/>
               </w:rPr>
-              <w:t xml:space="preserve">Indices mensuels</w:t>
+              <w:t xml:space="preserve">Monthly index</w:t>
             </w:r>
           </w:p>
         </w:tc>
@@ -756,7 +744,7 @@
                 <w:szCs w:val="14"/>
                 <w:color w:val="000000"/>
               </w:rPr>
-              <w:t xml:space="preserve">Août 2025</w:t>
+              <w:t xml:space="preserve">August 2025</w:t>
             </w:r>
           </w:p>
         </w:tc>
@@ -810,7 +798,7 @@
                 <w:szCs w:val="14"/>
                 <w:color w:val="000000"/>
               </w:rPr>
-              <w:t xml:space="preserve">Mai 2026</w:t>
+              <w:t xml:space="preserve">May 2026</w:t>
             </w:r>
           </w:p>
         </w:tc>
@@ -864,7 +852,7 @@
                 <w:szCs w:val="14"/>
                 <w:color w:val="000000"/>
               </w:rPr>
-              <w:t xml:space="preserve">Juin 2026</w:t>
+              <w:t xml:space="preserve">June 2026</w:t>
             </w:r>
           </w:p>
         </w:tc>
@@ -918,7 +906,7 @@
                 <w:szCs w:val="14"/>
                 <w:color w:val="000000"/>
               </w:rPr>
-              <w:t xml:space="preserve">Juillet 2026</w:t>
+              <w:t xml:space="preserve">July 2026</w:t>
             </w:r>
           </w:p>
         </w:tc>
@@ -972,7 +960,7 @@
                 <w:szCs w:val="14"/>
                 <w:color w:val="000000"/>
               </w:rPr>
-              <w:t xml:space="preserve">Août 2026</w:t>
+              <w:t xml:space="preserve">August 2026</w:t>
             </w:r>
           </w:p>
         </w:tc>
@@ -1026,7 +1014,7 @@
                 <w:szCs w:val="14"/>
                 <w:color w:val="000000"/>
               </w:rPr>
-              <w:t xml:space="preserve">1 mois</w:t>
+              <w:t xml:space="preserve">1 month</w:t>
             </w:r>
           </w:p>
         </w:tc>
@@ -1080,7 +1068,7 @@
                 <w:szCs w:val="14"/>
                 <w:color w:val="000000"/>
               </w:rPr>
-              <w:t xml:space="preserve">3 mois</w:t>
+              <w:t xml:space="preserve">3 months</w:t>
             </w:r>
           </w:p>
         </w:tc>
@@ -1134,7 +1122,7 @@
                 <w:szCs w:val="14"/>
                 <w:color w:val="000000"/>
               </w:rPr>
-              <w:t xml:space="preserve">12 mois</w:t>
+              <w:t xml:space="preserve">12 months</w:t>
             </w:r>
           </w:p>
         </w:tc>
@@ -1194,7 +1182,7 @@
                 <w:szCs w:val="14"/>
                 <w:color w:val="000000"/>
               </w:rPr>
-              <w:t xml:space="preserve">Produits alimentaires</w:t>
+              <w:t xml:space="preserve">Food products</w:t>
             </w:r>
           </w:p>
         </w:tc>
@@ -1740,7 +1728,7 @@
                 <w:szCs w:val="14"/>
                 <w:color w:val="000000"/>
               </w:rPr>
-              <w:t xml:space="preserve">01 - Produits alimentaires et boissons non alcoolisées</w:t>
+              <w:t xml:space="preserve">01 – Food products and non-alcoholic</w:t>
             </w:r>
           </w:p>
         </w:tc>
@@ -2286,7 +2274,7 @@
                 <w:szCs w:val="14"/>
                 <w:color w:val="000000"/>
               </w:rPr>
-              <w:t xml:space="preserve">02 - Boissons alcoolisées et tabac</w:t>
+              <w:t xml:space="preserve">02 –Alcoholicbeverages and tobacco</w:t>
             </w:r>
           </w:p>
         </w:tc>
@@ -2832,7 +2820,7 @@
                 <w:szCs w:val="14"/>
                 <w:color w:val="000000"/>
               </w:rPr>
-              <w:t xml:space="preserve">Produits non alimentaires</w:t>
+              <w:t xml:space="preserve">Non foodproducts</w:t>
             </w:r>
           </w:p>
         </w:tc>
@@ -3378,7 +3366,7 @@
                 <w:szCs w:val="14"/>
                 <w:color w:val="000000"/>
               </w:rPr>
-              <w:t xml:space="preserve">03 - Articles d'habillements et chaussures</w:t>
+              <w:t xml:space="preserve">03 – Clothing and shoes</w:t>
             </w:r>
           </w:p>
         </w:tc>
@@ -3924,7 +3912,7 @@
                 <w:szCs w:val="14"/>
                 <w:color w:val="000000"/>
               </w:rPr>
-              <w:t xml:space="preserve">04 - Logement, eau, gaz, électricité et autres combustibles</w:t>
+              <w:t xml:space="preserve">04 - Housing, water, gas, electricity and other fuel</w:t>
             </w:r>
           </w:p>
         </w:tc>
@@ -4470,7 +4458,7 @@
                 <w:szCs w:val="14"/>
                 <w:color w:val="000000"/>
               </w:rPr>
-              <w:t xml:space="preserve">05 - Meubles, articles de ménages et entretien courant du foyer</w:t>
+              <w:t xml:space="preserve">05- Furniture, household items and routine maintenance of the home</w:t>
             </w:r>
           </w:p>
         </w:tc>
@@ -5016,7 +5004,7 @@
                 <w:szCs w:val="14"/>
                 <w:color w:val="000000"/>
               </w:rPr>
-              <w:t xml:space="preserve">06 – Santé</w:t>
+              <w:t xml:space="preserve">06 –Health</w:t>
             </w:r>
           </w:p>
         </w:tc>
@@ -6108,7 +6096,7 @@
                 <w:szCs w:val="14"/>
                 <w:color w:val="000000"/>
               </w:rPr>
-              <w:t xml:space="preserve">08 – Communications</w:t>
+              <w:t xml:space="preserve">08 – Communication</w:t>
             </w:r>
           </w:p>
         </w:tc>
@@ -6654,7 +6642,7 @@
                 <w:szCs w:val="14"/>
                 <w:color w:val="000000"/>
               </w:rPr>
-              <w:t xml:space="preserve">09 - Loisirs et culture</w:t>
+              <w:t xml:space="preserve">09 – Leisure and culture</w:t>
             </w:r>
           </w:p>
         </w:tc>
@@ -7200,7 +7188,7 @@
                 <w:szCs w:val="14"/>
                 <w:color w:val="000000"/>
               </w:rPr>
-              <w:t xml:space="preserve">10 – Enseignement</w:t>
+              <w:t xml:space="preserve">10 –Education</w:t>
             </w:r>
           </w:p>
         </w:tc>
@@ -7746,7 +7734,7 @@
                 <w:szCs w:val="14"/>
                 <w:color w:val="000000"/>
               </w:rPr>
-              <w:t xml:space="preserve">11 - Restaurants et hôtels</w:t>
+              <w:t xml:space="preserve">11 - Restaurants and hotels</w:t>
             </w:r>
           </w:p>
         </w:tc>
@@ -8292,7 +8280,7 @@
                 <w:szCs w:val="14"/>
                 <w:color w:val="000000"/>
               </w:rPr>
-              <w:t xml:space="preserve">12 - Biens et services divers</w:t>
+              <w:t xml:space="preserve">12 – Variousgoods and services</w:t>
             </w:r>
           </w:p>
         </w:tc>
@@ -8838,7 +8826,7 @@
                 <w:szCs w:val="14"/>
                 <w:color w:val="000000"/>
               </w:rPr>
-              <w:t xml:space="preserve">Indice général</w:t>
+              <w:t xml:space="preserve">General index</w:t>
             </w:r>
           </w:p>
         </w:tc>
@@ -9344,7 +9332,7 @@
         <w:t xml:space="preserve"> </w:t>
       </w:r>
       <w:r>
-        <w:t xml:space="preserve">Haut-Commissariat au Plan, Direction de la Statistique – Enquête Nationale sur les Prix à la Consommation.</w:t>
+        <w:t xml:space="preserve">High Commission for Planning, Department of Statistics - National consumer price survey</w:t>
       </w:r>
     </w:p>
     <w:p>

</xml_diff>